<commit_message>
Protocolmanuscript BMJ Open herschreven: doorlopend betoog met conceptueel kader in drie lagen, SEBIA uit het script met COM-B/BCT-tabel, estimandtabel, vijf nieuwe figuren (scripts in figuren-src/bmj), checklists bijgewerkt, ICF als supplement 6 en indienlijst
Co-Authored-By: Claude Opus 5.5 <noreply@anthropic.com>
</commit_message>
<xml_diff>
--- a/protocol paper/BMJ Open/Online_supplemental_file_1_SPIRIT_2025.docx
+++ b/protocol paper/BMJ Open/Online_supplemental_file_1_SPIRIT_2025.docx
@@ -474,7 +474,7 @@
               <w:spacing w:before="40" w:after="40"/>
             </w:pPr>
             <w:r>
-              <w:t>Study design, setting and dates (p. 6) — protocol version 1.0, 17 May 2026</w:t>
+              <w:t>Trial design (p. 6) — protocol version 1.0, 17 May 2026</w:t>
             </w:r>
           </w:p>
         </w:tc>
@@ -567,7 +567,7 @@
               <w:spacing w:before="40" w:after="40"/>
             </w:pPr>
             <w:r>
-              <w:t>Title page (p. 1); Contributors (p. 17)</w:t>
+              <w:t>Title page (p. 1); Contributors (p. 22)</w:t>
             </w:r>
           </w:p>
         </w:tc>
@@ -659,7 +659,7 @@
               <w:spacing w:before="40" w:after="40"/>
             </w:pPr>
             <w:r>
-              <w:t>Funding (p. 17) — sponsor name and address</w:t>
+              <w:t>Funding (p. 22) — sponsor name and address</w:t>
             </w:r>
           </w:p>
         </w:tc>
@@ -751,7 +751,7 @@
               <w:spacing w:before="40" w:after="40"/>
             </w:pPr>
             <w:r>
-              <w:t>Funding (p. 17)</w:t>
+              <w:t>Funding (p. 22)</w:t>
             </w:r>
           </w:p>
         </w:tc>
@@ -843,7 +843,7 @@
               <w:spacing w:before="40" w:after="40"/>
             </w:pPr>
             <w:r>
-              <w:t>Data management, monitoring and safety (p. 16) — steering group; safety review</w:t>
+              <w:t>Monitoring, harms and safety (p. 20) — steering group; safety review</w:t>
             </w:r>
           </w:p>
         </w:tc>
@@ -1058,7 +1058,7 @@
               <w:spacing w:before="40" w:after="40"/>
             </w:pPr>
             <w:r>
-              <w:t>Ethics and dissemination (p. 16) — statistical analysis plan deposited before database lock</w:t>
+              <w:t>Ethics and dissemination (p. 21) — statistical analysis plan deposited before database lock</w:t>
             </w:r>
           </w:p>
         </w:tc>
@@ -1151,7 +1151,7 @@
               <w:spacing w:before="40" w:after="40"/>
             </w:pPr>
             <w:r>
-              <w:t>Data availability statement (p. 18)</w:t>
+              <w:t>Data availability statement (p. 23)</w:t>
             </w:r>
           </w:p>
         </w:tc>
@@ -1244,7 +1244,7 @@
               <w:spacing w:before="40" w:after="40"/>
             </w:pPr>
             <w:r>
-              <w:t>Funding (p. 17)</w:t>
+              <w:t>Funding (p. 22)</w:t>
             </w:r>
           </w:p>
         </w:tc>
@@ -1336,7 +1336,7 @@
               <w:spacing w:before="40" w:after="40"/>
             </w:pPr>
             <w:r>
-              <w:t>Competing interests (p. 17)</w:t>
+              <w:t>Competing interests (p. 22)</w:t>
             </w:r>
           </w:p>
         </w:tc>
@@ -1429,7 +1429,7 @@
               <w:spacing w:before="40" w:after="40"/>
             </w:pPr>
             <w:r>
-              <w:t>Ethics and dissemination (p. 16)</w:t>
+              <w:t>Ethics and dissemination (p. 21)</w:t>
             </w:r>
           </w:p>
         </w:tc>
@@ -1643,7 +1643,7 @@
               <w:spacing w:before="40" w:after="40"/>
             </w:pPr>
             <w:r>
-              <w:t>Usual care (p. 9); Blinding (p. 8)</w:t>
+              <w:t>Usual care (p. 9); Trial design (p. 6)</w:t>
             </w:r>
           </w:p>
         </w:tc>
@@ -1736,7 +1736,7 @@
               <w:spacing w:before="40" w:after="40"/>
             </w:pPr>
             <w:r>
-              <w:t>Objectives (p. 6)</w:t>
+              <w:t>Introduction (p. 4) — final paragraph (objectives and hypotheses)</w:t>
             </w:r>
           </w:p>
         </w:tc>
@@ -1858,7 +1858,7 @@
               <w:spacing w:before="40" w:after="40"/>
             </w:pPr>
             <w:r>
-              <w:t>Patient and public involvement (p. 16)</w:t>
+              <w:t>Patient and public involvement (p. 21)</w:t>
             </w:r>
           </w:p>
         </w:tc>
@@ -1951,7 +1951,7 @@
               <w:spacing w:before="40" w:after="40"/>
             </w:pPr>
             <w:r>
-              <w:t>Study design, setting and dates (p. 6)</w:t>
+              <w:t>Trial design (p. 6); figure 1</w:t>
             </w:r>
           </w:p>
         </w:tc>
@@ -2073,7 +2073,7 @@
               <w:spacing w:before="40" w:after="40"/>
             </w:pPr>
             <w:r>
-              <w:t>Study design, setting and dates (p. 6); online supplemental file 4</w:t>
+              <w:t>Setting (p. 8); online supplemental file 4</w:t>
             </w:r>
           </w:p>
         </w:tc>
@@ -2166,7 +2166,7 @@
               <w:spacing w:before="40" w:after="40"/>
             </w:pPr>
             <w:r>
-              <w:t>Inclusion criteria (p. 7); Exclusion criteria (p. 7)</w:t>
+              <w:t>Participants (p. 8)</w:t>
             </w:r>
           </w:p>
         </w:tc>
@@ -2258,7 +2258,7 @@
               <w:spacing w:before="40" w:after="40"/>
             </w:pPr>
             <w:r>
-              <w:t>Study design, setting and dates (p. 6); Training, tailoring and fidelity (p. 11)</w:t>
+              <w:t>Setting (p. 8); Training, tailoring and fidelity (p. 12)</w:t>
             </w:r>
           </w:p>
         </w:tc>
@@ -2351,7 +2351,7 @@
               <w:spacing w:before="40" w:after="40"/>
             </w:pPr>
             <w:r>
-              <w:t>Usual care (p. 9); Pressure-guided footwear optimisation (p. 10); Adherence monitoring and wear-time target (p. 10); Structured education and behavioural support (SEBIA) (p. 10); table 2; figure 2</w:t>
+              <w:t>Usual care (p. 9); PARADISE (p. 9); Measurement of wear and its use in counselling (p. 10); Structured education and behavioural support (SEBIA) (p. 11); table 2; figures 4 and 5</w:t>
             </w:r>
           </w:p>
         </w:tc>
@@ -2443,7 +2443,7 @@
               <w:spacing w:before="40" w:after="40"/>
             </w:pPr>
             <w:r>
-              <w:t>Training, tailoring and fidelity (p. 11); Participant timeline and data collection (p. 12)</w:t>
+              <w:t>Training, tailoring and fidelity (p. 12); Concomitant care and discontinuation (p. 13)</w:t>
             </w:r>
           </w:p>
         </w:tc>
@@ -2535,7 +2535,7 @@
               <w:spacing w:before="40" w:after="40"/>
             </w:pPr>
             <w:r>
-              <w:t>Training, tailoring and fidelity (p. 11); Process evaluation (p. 15)</w:t>
+              <w:t>Training, tailoring and fidelity (p. 12); Process evaluation (p. 19)</w:t>
             </w:r>
           </w:p>
         </w:tc>
@@ -2627,7 +2627,7 @@
               <w:spacing w:before="40" w:after="40"/>
             </w:pPr>
             <w:r>
-              <w:t>Concomitant care (p. 11)</w:t>
+              <w:t>Concomitant care and discontinuation (p. 13)</w:t>
             </w:r>
           </w:p>
         </w:tc>
@@ -2720,7 +2720,7 @@
               <w:spacing w:before="40" w:after="40"/>
             </w:pPr>
             <w:r>
-              <w:t>Primary outcome (p. 11); Mediator (p. 12); Secondary outcomes (p. 12); Exploratory outcome (p. 12); Process outcomes (p. 12); table 3</w:t>
+              <w:t>Primary outcome (p. 13); Mediator (p. 13); Secondary outcomes (p. 14); Exploratory outcome (p. 14); Process outcomes (p. 14); table 3</w:t>
             </w:r>
           </w:p>
         </w:tc>
@@ -2813,7 +2813,7 @@
               <w:spacing w:before="40" w:after="40"/>
             </w:pPr>
             <w:r>
-              <w:t>Data management, monitoring and safety (p. 16)</w:t>
+              <w:t>Monitoring, harms and safety (p. 20)</w:t>
             </w:r>
           </w:p>
         </w:tc>
@@ -2906,7 +2906,7 @@
               <w:spacing w:before="40" w:after="40"/>
             </w:pPr>
             <w:r>
-              <w:t>Participant timeline and data collection (p. 12); table 1; figure 2</w:t>
+              <w:t>Participant timeline (p. 14); table 1; figure 4</w:t>
             </w:r>
           </w:p>
         </w:tc>
@@ -2999,7 +2999,7 @@
               <w:spacing w:before="40" w:after="40"/>
             </w:pPr>
             <w:r>
-              <w:t>Sample size (p. 13); online supplemental file 5</w:t>
+              <w:t>Sample size (p. 15); online supplemental file 5</w:t>
             </w:r>
           </w:p>
         </w:tc>
@@ -3092,7 +3092,7 @@
               <w:spacing w:before="40" w:after="40"/>
             </w:pPr>
             <w:r>
-              <w:t>Recruitment (p. 7)</w:t>
+              <w:t>Participants (p. 8) — final paragraph (recruitment)</w:t>
             </w:r>
           </w:p>
         </w:tc>
@@ -3243,7 +3243,7 @@
               <w:spacing w:before="40" w:after="40"/>
             </w:pPr>
             <w:r>
-              <w:t>Randomisation and allocation concealment (p. 7)</w:t>
+              <w:t>Randomisation and allocation concealment (p. 15)</w:t>
             </w:r>
           </w:p>
         </w:tc>
@@ -3335,7 +3335,7 @@
               <w:spacing w:before="40" w:after="40"/>
             </w:pPr>
             <w:r>
-              <w:t>Randomisation and allocation concealment (p. 7) — stratified by centre, no blocks</w:t>
+              <w:t>Randomisation and allocation concealment (p. 15) — stratified by clinic, no blocks</w:t>
             </w:r>
           </w:p>
         </w:tc>
@@ -3428,7 +3428,7 @@
               <w:spacing w:before="40" w:after="40"/>
             </w:pPr>
             <w:r>
-              <w:t>Randomisation and allocation concealment (p. 7) — sequentially numbered opaque sealed envelopes</w:t>
+              <w:t>Randomisation and allocation concealment (p. 15) — sequentially numbered opaque sealed envelopes</w:t>
             </w:r>
           </w:p>
         </w:tc>
@@ -3521,7 +3521,7 @@
               <w:spacing w:before="40" w:after="40"/>
             </w:pPr>
             <w:r>
-              <w:t>Randomisation and allocation concealment (p. 7)</w:t>
+              <w:t>Randomisation and allocation concealment (p. 15)</w:t>
             </w:r>
           </w:p>
         </w:tc>
@@ -3614,7 +3614,7 @@
               <w:spacing w:before="40" w:after="40"/>
             </w:pPr>
             <w:r>
-              <w:t>Blinding (p. 8)</w:t>
+              <w:t>Blinding and other sources of bias (p. 16)</w:t>
             </w:r>
           </w:p>
         </w:tc>
@@ -3706,7 +3706,7 @@
               <w:spacing w:before="40" w:after="40"/>
             </w:pPr>
             <w:r>
-              <w:t>Blinding (p. 8) — pressure values hidden in usual care (50 kPa display threshold, values off)</w:t>
+              <w:t>Blinding and other sources of bias (p. 16) — pressure values hidden in usual care (50 kPa display threshold, values off)</w:t>
             </w:r>
           </w:p>
         </w:tc>
@@ -3798,7 +3798,7 @@
               <w:spacing w:before="40" w:after="40"/>
             </w:pPr>
             <w:r>
-              <w:t>Not applicable: open-label trial; clinical findings are always reported to the treating clinician, Blinding (p. 8)</w:t>
+              <w:t>Not applicable: open-label trial; clinical findings are always reported to the treating clinician, Blinding and other sources of bias (p. 16)</w:t>
             </w:r>
           </w:p>
         </w:tc>
@@ -3920,7 +3920,7 @@
               <w:spacing w:before="40" w:after="40"/>
             </w:pPr>
             <w:r>
-              <w:t>Participant timeline and data collection (p. 12); table 3</w:t>
+              <w:t>Outcomes (p. 13); Data collection and management (p. 16); table 3</w:t>
             </w:r>
           </w:p>
         </w:tc>
@@ -4012,7 +4012,7 @@
               <w:spacing w:before="40" w:after="40"/>
             </w:pPr>
             <w:r>
-              <w:t>Participant timeline and data collection (p. 12) — visits aligned with routine review, reminders, travel costs, continued follow-up after stopping the intervention</w:t>
+              <w:t>Participant timeline (p. 14) — visits aligned with routine review, reminders, travel costs, continued follow-up after stopping the intervention</w:t>
             </w:r>
           </w:p>
         </w:tc>
@@ -4105,7 +4105,7 @@
               <w:spacing w:before="40" w:after="40"/>
             </w:pPr>
             <w:r>
-              <w:t>Participant timeline and data collection (p. 12); Data management, monitoring and safety (p. 16)</w:t>
+              <w:t>Data collection and management (p. 16)</w:t>
             </w:r>
           </w:p>
         </w:tc>
@@ -4198,7 +4198,7 @@
               <w:spacing w:before="40" w:after="40"/>
             </w:pPr>
             <w:r>
-              <w:t>Primary analysis (p. 14); Adherence and mediation (p. 14); Secondary and subgroup analyses (p. 14)</w:t>
+              <w:t>Primary analysis (p. 17); Adherence and mediation (p. 18); Secondary, subgroup and sensitivity analyses (p. 18)</w:t>
             </w:r>
           </w:p>
         </w:tc>
@@ -4290,7 +4290,7 @@
               <w:spacing w:before="40" w:after="40"/>
             </w:pPr>
             <w:r>
-              <w:t>Statistical analysis (p. 13)</w:t>
+              <w:t>Statistical analysis (p. 17)</w:t>
             </w:r>
           </w:p>
         </w:tc>
@@ -4382,7 +4382,7 @@
               <w:spacing w:before="40" w:after="40"/>
             </w:pPr>
             <w:r>
-              <w:t>Missing data (p. 15)</w:t>
+              <w:t>Missing data (p. 18)</w:t>
             </w:r>
           </w:p>
         </w:tc>
@@ -4474,7 +4474,7 @@
               <w:spacing w:before="40" w:after="40"/>
             </w:pPr>
             <w:r>
-              <w:t>Estimands (p. 13); Secondary and subgroup analyses (p. 14); Exploratory analysis (p. 14)</w:t>
+              <w:t>Estimands (p. 17); Secondary, subgroup and sensitivity analyses (p. 18); Exploratory analysis (p. 18); table 4</w:t>
             </w:r>
           </w:p>
         </w:tc>
@@ -4596,7 +4596,7 @@
               <w:spacing w:before="40" w:after="40"/>
             </w:pPr>
             <w:r>
-              <w:t>Data management, monitoring and safety (p. 16) — no independent data monitoring committee, with rationale</w:t>
+              <w:t>Monitoring, harms and safety (p. 20) — no independent data monitoring committee, with rationale</w:t>
             </w:r>
           </w:p>
         </w:tc>
@@ -4688,7 +4688,7 @@
               <w:spacing w:before="40" w:after="40"/>
             </w:pPr>
             <w:r>
-              <w:t>Data management, monitoring and safety (p. 16) — no interim efficacy analysis; six-monthly safety review rule</w:t>
+              <w:t>Monitoring, harms and safety (p. 20) — no interim efficacy analysis; six-monthly safety review rule</w:t>
             </w:r>
           </w:p>
         </w:tc>
@@ -4781,7 +4781,7 @@
               <w:spacing w:before="40" w:after="40"/>
             </w:pPr>
             <w:r>
-              <w:t>Data management, monitoring and safety (p. 16)</w:t>
+              <w:t>Monitoring, harms and safety (p. 20)</w:t>
             </w:r>
           </w:p>
         </w:tc>
@@ -4903,7 +4903,7 @@
               <w:spacing w:before="40" w:after="40"/>
             </w:pPr>
             <w:r>
-              <w:t>Ethics and dissemination (p. 16); Ethics approval (p. 18)</w:t>
+              <w:t>Ethics and dissemination (p. 21); Ethics approval (p. 22)</w:t>
             </w:r>
           </w:p>
         </w:tc>
@@ -4996,7 +4996,7 @@
               <w:spacing w:before="40" w:after="40"/>
             </w:pPr>
             <w:r>
-              <w:t>Ethics and dissemination (p. 16)</w:t>
+              <w:t>Ethics and dissemination (p. 21)</w:t>
             </w:r>
           </w:p>
         </w:tc>
@@ -5089,7 +5089,7 @@
               <w:spacing w:before="40" w:after="40"/>
             </w:pPr>
             <w:r>
-              <w:t>Ethics and dissemination (p. 16); online supplemental file 6</w:t>
+              <w:t>Ethics and dissemination (p. 21); online supplemental file 6</w:t>
             </w:r>
           </w:p>
         </w:tc>
@@ -5181,7 +5181,7 @@
               <w:spacing w:before="40" w:after="40"/>
             </w:pPr>
             <w:r>
-              <w:t>Data availability statement (p. 18)</w:t>
+              <w:t>Data availability statement (p. 23)</w:t>
             </w:r>
           </w:p>
         </w:tc>
@@ -5274,7 +5274,7 @@
               <w:spacing w:before="40" w:after="40"/>
             </w:pPr>
             <w:r>
-              <w:t>Participant timeline and data collection (p. 12); Data management, monitoring and safety (p. 16)</w:t>
+              <w:t>Data collection and management (p. 16)</w:t>
             </w:r>
           </w:p>
         </w:tc>
@@ -5367,7 +5367,7 @@
               <w:spacing w:before="40" w:after="40"/>
             </w:pPr>
             <w:r>
-              <w:t>Ethics and dissemination (p. 16) — no-fault insurance; participants keep their orthoses</w:t>
+              <w:t>Ethics and dissemination (p. 21) — no-fault insurance; participants keep their orthoses</w:t>
             </w:r>
           </w:p>
         </w:tc>

</xml_diff>

<commit_message>
Protocolmanuscript BMJ Open: tabellen in de tekst waar ze voor het eerst genoemd worden (BMJ-eis), lange tabellen op een nieuwe pagina; checklists met nieuwe paginanummers
Co-Authored-By: Claude Opus 5.5 <noreply@anthropic.com>
</commit_message>
<xml_diff>
--- a/protocol paper/BMJ Open/Online_supplemental_file_1_SPIRIT_2025.docx
+++ b/protocol paper/BMJ Open/Online_supplemental_file_1_SPIRIT_2025.docx
@@ -474,7 +474,7 @@
               <w:spacing w:before="40" w:after="40"/>
             </w:pPr>
             <w:r>
-              <w:t>Trial design (p. 6) — protocol version 1.0, 17 May 2026</w:t>
+              <w:t>Trial design (p. 7) — protocol version 1.0, 17 May 2026</w:t>
             </w:r>
           </w:p>
         </w:tc>
@@ -567,7 +567,7 @@
               <w:spacing w:before="40" w:after="40"/>
             </w:pPr>
             <w:r>
-              <w:t>Title page (p. 1); Contributors (p. 22)</w:t>
+              <w:t>Title page (p. 1); Contributors (p. 26)</w:t>
             </w:r>
           </w:p>
         </w:tc>
@@ -659,7 +659,7 @@
               <w:spacing w:before="40" w:after="40"/>
             </w:pPr>
             <w:r>
-              <w:t>Funding (p. 22) — sponsor name and address</w:t>
+              <w:t>Funding (p. 26) — sponsor name and address</w:t>
             </w:r>
           </w:p>
         </w:tc>
@@ -751,7 +751,7 @@
               <w:spacing w:before="40" w:after="40"/>
             </w:pPr>
             <w:r>
-              <w:t>Funding (p. 22)</w:t>
+              <w:t>Funding (p. 26)</w:t>
             </w:r>
           </w:p>
         </w:tc>
@@ -843,7 +843,7 @@
               <w:spacing w:before="40" w:after="40"/>
             </w:pPr>
             <w:r>
-              <w:t>Monitoring, harms and safety (p. 20) — steering group; safety review</w:t>
+              <w:t>Monitoring, harms and safety (p. 24) — steering group; safety review</w:t>
             </w:r>
           </w:p>
         </w:tc>
@@ -1058,7 +1058,7 @@
               <w:spacing w:before="40" w:after="40"/>
             </w:pPr>
             <w:r>
-              <w:t>Ethics and dissemination (p. 21) — statistical analysis plan deposited before database lock</w:t>
+              <w:t>Ethics and dissemination (p. 25) — statistical analysis plan deposited before database lock</w:t>
             </w:r>
           </w:p>
         </w:tc>
@@ -1151,7 +1151,7 @@
               <w:spacing w:before="40" w:after="40"/>
             </w:pPr>
             <w:r>
-              <w:t>Data availability statement (p. 23)</w:t>
+              <w:t>Data availability statement (p. 27)</w:t>
             </w:r>
           </w:p>
         </w:tc>
@@ -1244,7 +1244,7 @@
               <w:spacing w:before="40" w:after="40"/>
             </w:pPr>
             <w:r>
-              <w:t>Funding (p. 22)</w:t>
+              <w:t>Funding (p. 26)</w:t>
             </w:r>
           </w:p>
         </w:tc>
@@ -1336,7 +1336,7 @@
               <w:spacing w:before="40" w:after="40"/>
             </w:pPr>
             <w:r>
-              <w:t>Competing interests (p. 22)</w:t>
+              <w:t>Competing interests (p. 26)</w:t>
             </w:r>
           </w:p>
         </w:tc>
@@ -1429,7 +1429,7 @@
               <w:spacing w:before="40" w:after="40"/>
             </w:pPr>
             <w:r>
-              <w:t>Ethics and dissemination (p. 21)</w:t>
+              <w:t>Ethics and dissemination (p. 25)</w:t>
             </w:r>
           </w:p>
         </w:tc>
@@ -1643,7 +1643,7 @@
               <w:spacing w:before="40" w:after="40"/>
             </w:pPr>
             <w:r>
-              <w:t>Usual care (p. 9); Trial design (p. 6)</w:t>
+              <w:t>Usual care (p. 11); Trial design (p. 7)</w:t>
             </w:r>
           </w:p>
         </w:tc>
@@ -1858,7 +1858,7 @@
               <w:spacing w:before="40" w:after="40"/>
             </w:pPr>
             <w:r>
-              <w:t>Patient and public involvement (p. 21)</w:t>
+              <w:t>Patient and public involvement (p. 25)</w:t>
             </w:r>
           </w:p>
         </w:tc>
@@ -1951,7 +1951,7 @@
               <w:spacing w:before="40" w:after="40"/>
             </w:pPr>
             <w:r>
-              <w:t>Trial design (p. 6); figure 1</w:t>
+              <w:t>Trial design (p. 7); figure 1</w:t>
             </w:r>
           </w:p>
         </w:tc>
@@ -2073,7 +2073,7 @@
               <w:spacing w:before="40" w:after="40"/>
             </w:pPr>
             <w:r>
-              <w:t>Setting (p. 8); online supplemental file 4</w:t>
+              <w:t>Setting (p. 9); online supplemental file 4</w:t>
             </w:r>
           </w:p>
         </w:tc>
@@ -2166,7 +2166,7 @@
               <w:spacing w:before="40" w:after="40"/>
             </w:pPr>
             <w:r>
-              <w:t>Participants (p. 8)</w:t>
+              <w:t>Participants (p. 10)</w:t>
             </w:r>
           </w:p>
         </w:tc>
@@ -2258,7 +2258,7 @@
               <w:spacing w:before="40" w:after="40"/>
             </w:pPr>
             <w:r>
-              <w:t>Setting (p. 8); Training, tailoring and fidelity (p. 12)</w:t>
+              <w:t>Setting (p. 9); Training, tailoring and fidelity (p. 14)</w:t>
             </w:r>
           </w:p>
         </w:tc>
@@ -2351,7 +2351,7 @@
               <w:spacing w:before="40" w:after="40"/>
             </w:pPr>
             <w:r>
-              <w:t>Usual care (p. 9); PARADISE (p. 9); Measurement of wear and its use in counselling (p. 10); Structured education and behavioural support (SEBIA) (p. 11); table 2; figures 4 and 5</w:t>
+              <w:t>Usual care (p. 11); PARADISE (p. 11); Measurement of wear and its use in counselling (p. 12); Structured education and behavioural support (SEBIA) (p. 13); table 2; figures 4 and 5</w:t>
             </w:r>
           </w:p>
         </w:tc>
@@ -2443,7 +2443,7 @@
               <w:spacing w:before="40" w:after="40"/>
             </w:pPr>
             <w:r>
-              <w:t>Training, tailoring and fidelity (p. 12); Concomitant care and discontinuation (p. 13)</w:t>
+              <w:t>Training, tailoring and fidelity (p. 14); Concomitant care and discontinuation (p. 14)</w:t>
             </w:r>
           </w:p>
         </w:tc>
@@ -2535,7 +2535,7 @@
               <w:spacing w:before="40" w:after="40"/>
             </w:pPr>
             <w:r>
-              <w:t>Training, tailoring and fidelity (p. 12); Process evaluation (p. 20)</w:t>
+              <w:t>Training, tailoring and fidelity (p. 14); Process evaluation (p. 23)</w:t>
             </w:r>
           </w:p>
         </w:tc>
@@ -2627,7 +2627,7 @@
               <w:spacing w:before="40" w:after="40"/>
             </w:pPr>
             <w:r>
-              <w:t>Concomitant care and discontinuation (p. 13)</w:t>
+              <w:t>Concomitant care and discontinuation (p. 14)</w:t>
             </w:r>
           </w:p>
         </w:tc>
@@ -2720,7 +2720,7 @@
               <w:spacing w:before="40" w:after="40"/>
             </w:pPr>
             <w:r>
-              <w:t>Primary outcome (p. 13); Mediator (p. 13); Secondary outcomes (p. 14); Exploratory outcome (p. 14); Process outcomes (p. 14); table 3</w:t>
+              <w:t>Primary outcome (p. 16); Mediator (p. 17); Secondary outcomes (p. 17); Exploratory outcome (p. 18); Process outcomes (p. 18); table 3</w:t>
             </w:r>
           </w:p>
         </w:tc>
@@ -2813,7 +2813,7 @@
               <w:spacing w:before="40" w:after="40"/>
             </w:pPr>
             <w:r>
-              <w:t>Monitoring, harms and safety (p. 20)</w:t>
+              <w:t>Monitoring, harms and safety (p. 24)</w:t>
             </w:r>
           </w:p>
         </w:tc>
@@ -2906,7 +2906,7 @@
               <w:spacing w:before="40" w:after="40"/>
             </w:pPr>
             <w:r>
-              <w:t>Participant timeline (p. 14); table 1; figure 4</w:t>
+              <w:t>Participant timeline (p. 18); table 1; figure 4</w:t>
             </w:r>
           </w:p>
         </w:tc>
@@ -2999,7 +2999,7 @@
               <w:spacing w:before="40" w:after="40"/>
             </w:pPr>
             <w:r>
-              <w:t>Sample size (p. 15); online supplemental file 5</w:t>
+              <w:t>Sample size (p. 18); online supplemental file 5</w:t>
             </w:r>
           </w:p>
         </w:tc>
@@ -3092,7 +3092,7 @@
               <w:spacing w:before="40" w:after="40"/>
             </w:pPr>
             <w:r>
-              <w:t>Participants (p. 8) — final paragraph (recruitment)</w:t>
+              <w:t>Participants (p. 10) — final paragraph (recruitment)</w:t>
             </w:r>
           </w:p>
         </w:tc>
@@ -3243,7 +3243,7 @@
               <w:spacing w:before="40" w:after="40"/>
             </w:pPr>
             <w:r>
-              <w:t>Randomisation and allocation concealment (p. 15)</w:t>
+              <w:t>Randomisation and allocation concealment (p. 19)</w:t>
             </w:r>
           </w:p>
         </w:tc>
@@ -3335,7 +3335,7 @@
               <w:spacing w:before="40" w:after="40"/>
             </w:pPr>
             <w:r>
-              <w:t>Randomisation and allocation concealment (p. 15) — stratified by clinic, no blocks</w:t>
+              <w:t>Randomisation and allocation concealment (p. 19) — stratified by clinic, no blocks</w:t>
             </w:r>
           </w:p>
         </w:tc>
@@ -3428,7 +3428,7 @@
               <w:spacing w:before="40" w:after="40"/>
             </w:pPr>
             <w:r>
-              <w:t>Randomisation and allocation concealment (p. 15) — sequentially numbered opaque sealed envelopes</w:t>
+              <w:t>Randomisation and allocation concealment (p. 19) — sequentially numbered opaque sealed envelopes</w:t>
             </w:r>
           </w:p>
         </w:tc>
@@ -3521,7 +3521,7 @@
               <w:spacing w:before="40" w:after="40"/>
             </w:pPr>
             <w:r>
-              <w:t>Randomisation and allocation concealment (p. 15)</w:t>
+              <w:t>Randomisation and allocation concealment (p. 19)</w:t>
             </w:r>
           </w:p>
         </w:tc>
@@ -3614,7 +3614,7 @@
               <w:spacing w:before="40" w:after="40"/>
             </w:pPr>
             <w:r>
-              <w:t>Blinding and other sources of bias (p. 16)</w:t>
+              <w:t>Blinding and other sources of bias (p. 19)</w:t>
             </w:r>
           </w:p>
         </w:tc>
@@ -3706,7 +3706,7 @@
               <w:spacing w:before="40" w:after="40"/>
             </w:pPr>
             <w:r>
-              <w:t>Blinding and other sources of bias (p. 16) — pressure values hidden in usual care (50 kPa display threshold, values off)</w:t>
+              <w:t>Blinding and other sources of bias (p. 19) — pressure values hidden in usual care (50 kPa display threshold, values off)</w:t>
             </w:r>
           </w:p>
         </w:tc>
@@ -3798,7 +3798,7 @@
               <w:spacing w:before="40" w:after="40"/>
             </w:pPr>
             <w:r>
-              <w:t>Not applicable: open-label trial; clinical findings are always reported to the treating clinician, Blinding and other sources of bias (p. 16)</w:t>
+              <w:t>Not applicable: open-label trial; clinical findings are always reported to the treating clinician, Blinding and other sources of bias (p. 19)</w:t>
             </w:r>
           </w:p>
         </w:tc>
@@ -3920,7 +3920,7 @@
               <w:spacing w:before="40" w:after="40"/>
             </w:pPr>
             <w:r>
-              <w:t>Outcomes (p. 13); Data collection and management (p. 17); table 3</w:t>
+              <w:t>Outcomes (p. 15); Data collection and management (p. 20); table 3</w:t>
             </w:r>
           </w:p>
         </w:tc>
@@ -4012,7 +4012,7 @@
               <w:spacing w:before="40" w:after="40"/>
             </w:pPr>
             <w:r>
-              <w:t>Participant timeline (p. 14) — visits aligned with routine review, reminders, travel costs, continued follow-up after stopping the intervention</w:t>
+              <w:t>Participant timeline (p. 18) — visits aligned with routine review, reminders, travel costs, continued follow-up after stopping the intervention</w:t>
             </w:r>
           </w:p>
         </w:tc>
@@ -4105,7 +4105,7 @@
               <w:spacing w:before="40" w:after="40"/>
             </w:pPr>
             <w:r>
-              <w:t>Data collection and management (p. 17)</w:t>
+              <w:t>Data collection and management (p. 20)</w:t>
             </w:r>
           </w:p>
         </w:tc>
@@ -4198,7 +4198,7 @@
               <w:spacing w:before="40" w:after="40"/>
             </w:pPr>
             <w:r>
-              <w:t>Primary analysis (p. 17); Adherence and mediation (p. 18); Secondary, subgroup and sensitivity analyses (p. 18)</w:t>
+              <w:t>Primary analysis (p. 21); Adherence and mediation (p. 22); Secondary, subgroup and sensitivity analyses (p. 22)</w:t>
             </w:r>
           </w:p>
         </w:tc>
@@ -4290,7 +4290,7 @@
               <w:spacing w:before="40" w:after="40"/>
             </w:pPr>
             <w:r>
-              <w:t>Statistical analysis (p. 17)</w:t>
+              <w:t>Statistical analysis (p. 20)</w:t>
             </w:r>
           </w:p>
         </w:tc>
@@ -4382,7 +4382,7 @@
               <w:spacing w:before="40" w:after="40"/>
             </w:pPr>
             <w:r>
-              <w:t>Missing data (p. 19)</w:t>
+              <w:t>Missing data (p. 22)</w:t>
             </w:r>
           </w:p>
         </w:tc>
@@ -4474,7 +4474,7 @@
               <w:spacing w:before="40" w:after="40"/>
             </w:pPr>
             <w:r>
-              <w:t>Estimands (p. 17); Secondary, subgroup and sensitivity analyses (p. 18); Exploratory analysis (p. 18); table 4</w:t>
+              <w:t>Estimands (p. 21); Secondary, subgroup and sensitivity analyses (p. 22); Exploratory analysis (p. 22); table 4</w:t>
             </w:r>
           </w:p>
         </w:tc>
@@ -4596,7 +4596,7 @@
               <w:spacing w:before="40" w:after="40"/>
             </w:pPr>
             <w:r>
-              <w:t>Monitoring, harms and safety (p. 20) — no independent data monitoring committee, with rationale</w:t>
+              <w:t>Monitoring, harms and safety (p. 24) — no independent data monitoring committee, with rationale</w:t>
             </w:r>
           </w:p>
         </w:tc>
@@ -4688,7 +4688,7 @@
               <w:spacing w:before="40" w:after="40"/>
             </w:pPr>
             <w:r>
-              <w:t>Monitoring, harms and safety (p. 20) — no interim efficacy analysis; six-monthly safety review rule</w:t>
+              <w:t>Monitoring, harms and safety (p. 24) — no interim efficacy analysis; six-monthly safety review rule</w:t>
             </w:r>
           </w:p>
         </w:tc>
@@ -4781,7 +4781,7 @@
               <w:spacing w:before="40" w:after="40"/>
             </w:pPr>
             <w:r>
-              <w:t>Monitoring, harms and safety (p. 20)</w:t>
+              <w:t>Monitoring, harms and safety (p. 24)</w:t>
             </w:r>
           </w:p>
         </w:tc>
@@ -4903,7 +4903,7 @@
               <w:spacing w:before="40" w:after="40"/>
             </w:pPr>
             <w:r>
-              <w:t>Ethics and dissemination (p. 21); Ethics approval (p. 23)</w:t>
+              <w:t>Ethics and dissemination (p. 25); Ethics approval (p. 26)</w:t>
             </w:r>
           </w:p>
         </w:tc>
@@ -4996,7 +4996,7 @@
               <w:spacing w:before="40" w:after="40"/>
             </w:pPr>
             <w:r>
-              <w:t>Ethics and dissemination (p. 21)</w:t>
+              <w:t>Ethics and dissemination (p. 25)</w:t>
             </w:r>
           </w:p>
         </w:tc>
@@ -5089,7 +5089,7 @@
               <w:spacing w:before="40" w:after="40"/>
             </w:pPr>
             <w:r>
-              <w:t>Ethics and dissemination (p. 21); online supplemental file 6</w:t>
+              <w:t>Ethics and dissemination (p. 25); online supplemental file 6</w:t>
             </w:r>
           </w:p>
         </w:tc>
@@ -5181,7 +5181,7 @@
               <w:spacing w:before="40" w:after="40"/>
             </w:pPr>
             <w:r>
-              <w:t>Data availability statement (p. 23)</w:t>
+              <w:t>Data availability statement (p. 27)</w:t>
             </w:r>
           </w:p>
         </w:tc>
@@ -5274,7 +5274,7 @@
               <w:spacing w:before="40" w:after="40"/>
             </w:pPr>
             <w:r>
-              <w:t>Data collection and management (p. 17)</w:t>
+              <w:t>Data collection and management (p. 20)</w:t>
             </w:r>
           </w:p>
         </w:tc>
@@ -5367,7 +5367,7 @@
               <w:spacing w:before="40" w:after="40"/>
             </w:pPr>
             <w:r>
-              <w:t>Ethics and dissemination (p. 21) — no-fault insurance; participants keep their orthoses</w:t>
+              <w:t>Ethics and dissemination (p. 25) — no-fault insurance; participants keep their orthoses</w:t>
             </w:r>
           </w:p>
         </w:tc>

</xml_diff>